<commit_message>
refactor selenium reporting for medical and login tests
</commit_message>
<xml_diff>
--- a/Selenium_WebDriver/reports/Drug_Category_Test_Report.docx
+++ b/Selenium_WebDriver/reports/Drug_Category_Test_Report.docx
@@ -21,7 +21,7 @@
         <w:jc w:val="center"/>
       </w:pPr>
       <w:r>
-        <w:t>Thời gian tạo báo cáo: 30/08/2026 22:07:57</w:t>
+        <w:t>Thời gian tạo báo cáo: 30/08/2026 23:00:36</w:t>
       </w:r>
     </w:p>
     <w:p/>
@@ -288,17 +288,17 @@
           </w:tcPr>
           <w:p>
             <w:r>
-              <w:t>30/08/2026 22:05:05</w:t>
-            </w:r>
-          </w:p>
-        </w:tc>
-        <w:tc>
-          <w:tcPr>
-            <w:tcW w:type="dxa" w:w="1440"/>
-          </w:tcPr>
-          <w:p>
-            <w:r>
-              <w:t>5.46</w:t>
+              <w:t>30/08/2026 22:57:45</w:t>
+            </w:r>
+          </w:p>
+        </w:tc>
+        <w:tc>
+          <w:tcPr>
+            <w:tcW w:type="dxa" w:w="1440"/>
+          </w:tcPr>
+          <w:p>
+            <w:r>
+              <w:t>5.48</w:t>
             </w:r>
           </w:p>
         </w:tc>
@@ -346,17 +346,17 @@
           </w:tcPr>
           <w:p>
             <w:r>
-              <w:t>30/08/2026 22:05:17</w:t>
-            </w:r>
-          </w:p>
-        </w:tc>
-        <w:tc>
-          <w:tcPr>
-            <w:tcW w:type="dxa" w:w="1440"/>
-          </w:tcPr>
-          <w:p>
-            <w:r>
-              <w:t>8.38</w:t>
+              <w:t>30/08/2026 22:57:56</w:t>
+            </w:r>
+          </w:p>
+        </w:tc>
+        <w:tc>
+          <w:tcPr>
+            <w:tcW w:type="dxa" w:w="1440"/>
+          </w:tcPr>
+          <w:p>
+            <w:r>
+              <w:t>8.37</w:t>
             </w:r>
           </w:p>
         </w:tc>
@@ -404,17 +404,17 @@
           </w:tcPr>
           <w:p>
             <w:r>
-              <w:t>30/08/2026 22:05:36</w:t>
-            </w:r>
-          </w:p>
-        </w:tc>
-        <w:tc>
-          <w:tcPr>
-            <w:tcW w:type="dxa" w:w="1440"/>
-          </w:tcPr>
-          <w:p>
-            <w:r>
-              <w:t>15.51</w:t>
+              <w:t>30/08/2026 22:58:15</w:t>
+            </w:r>
+          </w:p>
+        </w:tc>
+        <w:tc>
+          <w:tcPr>
+            <w:tcW w:type="dxa" w:w="1440"/>
+          </w:tcPr>
+          <w:p>
+            <w:r>
+              <w:t>15.49</w:t>
             </w:r>
           </w:p>
         </w:tc>
@@ -462,17 +462,17 @@
           </w:tcPr>
           <w:p>
             <w:r>
-              <w:t>30/08/2026 22:05:51</w:t>
-            </w:r>
-          </w:p>
-        </w:tc>
-        <w:tc>
-          <w:tcPr>
-            <w:tcW w:type="dxa" w:w="1440"/>
-          </w:tcPr>
-          <w:p>
-            <w:r>
-              <w:t>12.22</w:t>
+              <w:t>30/08/2026 22:58:30</w:t>
+            </w:r>
+          </w:p>
+        </w:tc>
+        <w:tc>
+          <w:tcPr>
+            <w:tcW w:type="dxa" w:w="1440"/>
+          </w:tcPr>
+          <w:p>
+            <w:r>
+              <w:t>11.98</w:t>
             </w:r>
           </w:p>
         </w:tc>
@@ -520,17 +520,17 @@
           </w:tcPr>
           <w:p>
             <w:r>
-              <w:t>30/08/2026 22:06:10</w:t>
-            </w:r>
-          </w:p>
-        </w:tc>
-        <w:tc>
-          <w:tcPr>
-            <w:tcW w:type="dxa" w:w="1440"/>
-          </w:tcPr>
-          <w:p>
-            <w:r>
-              <w:t>15.00</w:t>
+              <w:t>30/08/2026 22:58:49</w:t>
+            </w:r>
+          </w:p>
+        </w:tc>
+        <w:tc>
+          <w:tcPr>
+            <w:tcW w:type="dxa" w:w="1440"/>
+          </w:tcPr>
+          <w:p>
+            <w:r>
+              <w:t>14.97</w:t>
             </w:r>
           </w:p>
         </w:tc>
@@ -578,17 +578,17 @@
           </w:tcPr>
           <w:p>
             <w:r>
-              <w:t>30/08/2026 22:06:25</w:t>
-            </w:r>
-          </w:p>
-        </w:tc>
-        <w:tc>
-          <w:tcPr>
-            <w:tcW w:type="dxa" w:w="1440"/>
-          </w:tcPr>
-          <w:p>
-            <w:r>
-              <w:t>12.03</w:t>
+              <w:t>30/08/2026 22:59:04</w:t>
+            </w:r>
+          </w:p>
+        </w:tc>
+        <w:tc>
+          <w:tcPr>
+            <w:tcW w:type="dxa" w:w="1440"/>
+          </w:tcPr>
+          <w:p>
+            <w:r>
+              <w:t>12.08</w:t>
             </w:r>
           </w:p>
         </w:tc>
@@ -636,17 +636,17 @@
           </w:tcPr>
           <w:p>
             <w:r>
-              <w:t>30/08/2026 22:06:43</w:t>
-            </w:r>
-          </w:p>
-        </w:tc>
-        <w:tc>
-          <w:tcPr>
-            <w:tcW w:type="dxa" w:w="1440"/>
-          </w:tcPr>
-          <w:p>
-            <w:r>
-              <w:t>14.58</w:t>
+              <w:t>30/08/2026 22:59:22</w:t>
+            </w:r>
+          </w:p>
+        </w:tc>
+        <w:tc>
+          <w:tcPr>
+            <w:tcW w:type="dxa" w:w="1440"/>
+          </w:tcPr>
+          <w:p>
+            <w:r>
+              <w:t>14.59</w:t>
             </w:r>
           </w:p>
         </w:tc>
@@ -694,17 +694,17 @@
           </w:tcPr>
           <w:p>
             <w:r>
-              <w:t>30/08/2026 22:06:53</w:t>
-            </w:r>
-          </w:p>
-        </w:tc>
-        <w:tc>
-          <w:tcPr>
-            <w:tcW w:type="dxa" w:w="1440"/>
-          </w:tcPr>
-          <w:p>
-            <w:r>
-              <w:t>6.96</w:t>
+              <w:t>30/08/2026 22:59:32</w:t>
+            </w:r>
+          </w:p>
+        </w:tc>
+        <w:tc>
+          <w:tcPr>
+            <w:tcW w:type="dxa" w:w="1440"/>
+          </w:tcPr>
+          <w:p>
+            <w:r>
+              <w:t>6.94</w:t>
             </w:r>
           </w:p>
         </w:tc>
@@ -752,17 +752,17 @@
           </w:tcPr>
           <w:p>
             <w:r>
-              <w:t>30/08/2026 22:07:03</w:t>
-            </w:r>
-          </w:p>
-        </w:tc>
-        <w:tc>
-          <w:tcPr>
-            <w:tcW w:type="dxa" w:w="1440"/>
-          </w:tcPr>
-          <w:p>
-            <w:r>
-              <w:t>7.14</w:t>
+              <w:t>30/08/2026 22:59:42</w:t>
+            </w:r>
+          </w:p>
+        </w:tc>
+        <w:tc>
+          <w:tcPr>
+            <w:tcW w:type="dxa" w:w="1440"/>
+          </w:tcPr>
+          <w:p>
+            <w:r>
+              <w:t>7.21</w:t>
             </w:r>
           </w:p>
         </w:tc>
@@ -810,17 +810,17 @@
           </w:tcPr>
           <w:p>
             <w:r>
-              <w:t>30/08/2026 22:07:24</w:t>
-            </w:r>
-          </w:p>
-        </w:tc>
-        <w:tc>
-          <w:tcPr>
-            <w:tcW w:type="dxa" w:w="1440"/>
-          </w:tcPr>
-          <w:p>
-            <w:r>
-              <w:t>17.78</w:t>
+              <w:t>30/08/2026 23:00:03</w:t>
+            </w:r>
+          </w:p>
+        </w:tc>
+        <w:tc>
+          <w:tcPr>
+            <w:tcW w:type="dxa" w:w="1440"/>
+          </w:tcPr>
+          <w:p>
+            <w:r>
+              <w:t>17.83</w:t>
             </w:r>
           </w:p>
         </w:tc>
@@ -870,17 +870,17 @@
           </w:tcPr>
           <w:p>
             <w:r>
-              <w:t>30/08/2026 22:07:54</w:t>
-            </w:r>
-          </w:p>
-        </w:tc>
-        <w:tc>
-          <w:tcPr>
-            <w:tcW w:type="dxa" w:w="1440"/>
-          </w:tcPr>
-          <w:p>
-            <w:r>
-              <w:t>26.78</w:t>
+              <w:t>30/08/2026 23:00:33</w:t>
+            </w:r>
+          </w:p>
+        </w:tc>
+        <w:tc>
+          <w:tcPr>
+            <w:tcW w:type="dxa" w:w="1440"/>
+          </w:tcPr>
+          <w:p>
+            <w:r>
+              <w:t>26.75</w:t>
             </w:r>
           </w:p>
         </w:tc>
@@ -1024,7 +1024,7 @@
           </w:tcPr>
           <w:p>
             <w:r>
-              <w:t>30/08/2026 22:05:02</w:t>
+              <w:t>30/08/2026 22:57:41</w:t>
             </w:r>
           </w:p>
         </w:tc>
@@ -1084,7 +1084,7 @@
           </w:tcPr>
           <w:p>
             <w:r>
-              <w:t>30/08/2026 22:05:02</w:t>
+              <w:t>30/08/2026 22:57:41</w:t>
             </w:r>
           </w:p>
         </w:tc>
@@ -1144,7 +1144,7 @@
           </w:tcPr>
           <w:p>
             <w:r>
-              <w:t>30/08/2026 22:05:05</w:t>
+              <w:t>30/08/2026 22:57:45</w:t>
             </w:r>
           </w:p>
         </w:tc>
@@ -1204,7 +1204,7 @@
           </w:tcPr>
           <w:p>
             <w:r>
-              <w:t>30/08/2026 22:05:05</w:t>
+              <w:t>30/08/2026 22:57:45</w:t>
             </w:r>
           </w:p>
         </w:tc>
@@ -1266,7 +1266,7 @@
           </w:tcPr>
           <w:p>
             <w:r>
-              <w:t>30/08/2026 22:05:05</w:t>
+              <w:t>30/08/2026 22:57:45</w:t>
             </w:r>
           </w:p>
         </w:tc>
@@ -1326,7 +1326,7 @@
           </w:tcPr>
           <w:p>
             <w:r>
-              <w:t>30/08/2026 22:05:05</w:t>
+              <w:t>30/08/2026 22:57:45</w:t>
             </w:r>
           </w:p>
         </w:tc>
@@ -1388,7 +1388,7 @@
           </w:tcPr>
           <w:p>
             <w:r>
-              <w:t>30/08/2026 22:05:05</w:t>
+              <w:t>30/08/2026 22:57:45</w:t>
             </w:r>
           </w:p>
         </w:tc>
@@ -1448,7 +1448,7 @@
           </w:tcPr>
           <w:p>
             <w:r>
-              <w:t>30/08/2026 22:05:11</w:t>
+              <w:t>30/08/2026 22:57:50</w:t>
             </w:r>
           </w:p>
         </w:tc>
@@ -1508,7 +1508,7 @@
           </w:tcPr>
           <w:p>
             <w:r>
-              <w:t>30/08/2026 22:05:14</w:t>
+              <w:t>30/08/2026 22:57:53</w:t>
             </w:r>
           </w:p>
         </w:tc>
@@ -1568,7 +1568,7 @@
           </w:tcPr>
           <w:p>
             <w:r>
-              <w:t>30/08/2026 22:05:17</w:t>
+              <w:t>30/08/2026 22:57:56</w:t>
             </w:r>
           </w:p>
         </w:tc>
@@ -1628,7 +1628,7 @@
           </w:tcPr>
           <w:p>
             <w:r>
-              <w:t>30/08/2026 22:05:17</w:t>
+              <w:t>30/08/2026 22:57:56</w:t>
             </w:r>
           </w:p>
         </w:tc>
@@ -1690,7 +1690,7 @@
           </w:tcPr>
           <w:p>
             <w:r>
-              <w:t>30/08/2026 22:05:17</w:t>
+              <w:t>30/08/2026 22:57:56</w:t>
             </w:r>
           </w:p>
         </w:tc>
@@ -1752,7 +1752,7 @@
           </w:tcPr>
           <w:p>
             <w:r>
-              <w:t>30/08/2026 22:05:17</w:t>
+              <w:t>30/08/2026 22:57:56</w:t>
             </w:r>
           </w:p>
         </w:tc>
@@ -1814,7 +1814,7 @@
           </w:tcPr>
           <w:p>
             <w:r>
-              <w:t>30/08/2026 22:05:17</w:t>
+              <w:t>30/08/2026 22:57:56</w:t>
             </w:r>
           </w:p>
         </w:tc>
@@ -1874,7 +1874,7 @@
           </w:tcPr>
           <w:p>
             <w:r>
-              <w:t>30/08/2026 22:05:22</w:t>
+              <w:t>30/08/2026 22:58:02</w:t>
             </w:r>
           </w:p>
         </w:tc>
@@ -1934,7 +1934,7 @@
           </w:tcPr>
           <w:p>
             <w:r>
-              <w:t>30/08/2026 22:05:26</w:t>
+              <w:t>30/08/2026 22:58:05</w:t>
             </w:r>
           </w:p>
         </w:tc>
@@ -1994,7 +1994,7 @@
           </w:tcPr>
           <w:p>
             <w:r>
-              <w:t>30/08/2026 22:05:29</w:t>
+              <w:t>30/08/2026 22:58:09</w:t>
             </w:r>
           </w:p>
         </w:tc>
@@ -2056,7 +2056,7 @@
           </w:tcPr>
           <w:p>
             <w:r>
-              <w:t>30/08/2026 22:05:29</w:t>
+              <w:t>30/08/2026 22:58:09</w:t>
             </w:r>
           </w:p>
         </w:tc>
@@ -2116,7 +2116,7 @@
           </w:tcPr>
           <w:p>
             <w:r>
-              <w:t>30/08/2026 22:05:29</w:t>
+              <w:t>30/08/2026 22:58:09</w:t>
             </w:r>
           </w:p>
         </w:tc>
@@ -2176,7 +2176,7 @@
           </w:tcPr>
           <w:p>
             <w:r>
-              <w:t>30/08/2026 22:05:30</w:t>
+              <w:t>30/08/2026 22:58:09</w:t>
             </w:r>
           </w:p>
         </w:tc>
@@ -2236,7 +2236,7 @@
           </w:tcPr>
           <w:p>
             <w:r>
-              <w:t>30/08/2026 22:05:30</w:t>
+              <w:t>30/08/2026 22:58:09</w:t>
             </w:r>
           </w:p>
         </w:tc>
@@ -2296,7 +2296,7 @@
           </w:tcPr>
           <w:p>
             <w:r>
-              <w:t>30/08/2026 22:05:32</w:t>
+              <w:t>30/08/2026 22:58:11</w:t>
             </w:r>
           </w:p>
         </w:tc>
@@ -2356,7 +2356,7 @@
           </w:tcPr>
           <w:p>
             <w:r>
-              <w:t>30/08/2026 22:05:36</w:t>
+              <w:t>30/08/2026 22:58:15</w:t>
             </w:r>
           </w:p>
         </w:tc>
@@ -2416,7 +2416,7 @@
           </w:tcPr>
           <w:p>
             <w:r>
-              <w:t>30/08/2026 22:05:36</w:t>
+              <w:t>30/08/2026 22:58:15</w:t>
             </w:r>
           </w:p>
         </w:tc>
@@ -2478,7 +2478,7 @@
           </w:tcPr>
           <w:p>
             <w:r>
-              <w:t>30/08/2026 22:05:41</w:t>
+              <w:t>30/08/2026 22:58:20</w:t>
             </w:r>
           </w:p>
         </w:tc>
@@ -2538,7 +2538,7 @@
           </w:tcPr>
           <w:p>
             <w:r>
-              <w:t>30/08/2026 22:05:44</w:t>
+              <w:t>30/08/2026 22:58:24</w:t>
             </w:r>
           </w:p>
         </w:tc>
@@ -2598,7 +2598,7 @@
           </w:tcPr>
           <w:p>
             <w:r>
-              <w:t>30/08/2026 22:05:47</w:t>
+              <w:t>30/08/2026 22:58:27</w:t>
             </w:r>
           </w:p>
         </w:tc>
@@ -2658,7 +2658,7 @@
           </w:tcPr>
           <w:p>
             <w:r>
-              <w:t>30/08/2026 22:05:51</w:t>
+              <w:t>30/08/2026 22:58:30</w:t>
             </w:r>
           </w:p>
         </w:tc>
@@ -2718,7 +2718,7 @@
           </w:tcPr>
           <w:p>
             <w:r>
-              <w:t>30/08/2026 22:05:51</w:t>
+              <w:t>30/08/2026 22:58:30</w:t>
             </w:r>
           </w:p>
         </w:tc>
@@ -2780,7 +2780,7 @@
           </w:tcPr>
           <w:p>
             <w:r>
-              <w:t>30/08/2026 22:05:51</w:t>
+              <w:t>30/08/2026 22:58:30</w:t>
             </w:r>
           </w:p>
         </w:tc>
@@ -2842,7 +2842,7 @@
           </w:tcPr>
           <w:p>
             <w:r>
-              <w:t>30/08/2026 22:05:57</w:t>
+              <w:t>30/08/2026 22:58:36</w:t>
             </w:r>
           </w:p>
         </w:tc>
@@ -2902,7 +2902,7 @@
           </w:tcPr>
           <w:p>
             <w:r>
-              <w:t>30/08/2026 22:06:00</w:t>
+              <w:t>30/08/2026 22:58:39</w:t>
             </w:r>
           </w:p>
         </w:tc>
@@ -2962,7 +2962,7 @@
           </w:tcPr>
           <w:p>
             <w:r>
-              <w:t>30/08/2026 22:06:03</w:t>
+              <w:t>30/08/2026 22:58:42</w:t>
             </w:r>
           </w:p>
         </w:tc>
@@ -3022,7 +3022,7 @@
           </w:tcPr>
           <w:p>
             <w:r>
-              <w:t>30/08/2026 22:06:03</w:t>
+              <w:t>30/08/2026 22:58:42</w:t>
             </w:r>
           </w:p>
         </w:tc>
@@ -3082,7 +3082,7 @@
           </w:tcPr>
           <w:p>
             <w:r>
-              <w:t>30/08/2026 22:06:07</w:t>
+              <w:t>30/08/2026 22:58:46</w:t>
             </w:r>
           </w:p>
         </w:tc>
@@ -3142,7 +3142,7 @@
           </w:tcPr>
           <w:p>
             <w:r>
-              <w:t>30/08/2026 22:06:10</w:t>
+              <w:t>30/08/2026 22:58:49</w:t>
             </w:r>
           </w:p>
         </w:tc>
@@ -3204,7 +3204,7 @@
           </w:tcPr>
           <w:p>
             <w:r>
-              <w:t>30/08/2026 22:06:10</w:t>
+              <w:t>30/08/2026 22:58:49</w:t>
             </w:r>
           </w:p>
         </w:tc>
@@ -3264,7 +3264,7 @@
           </w:tcPr>
           <w:p>
             <w:r>
-              <w:t>30/08/2026 22:06:10</w:t>
+              <w:t>30/08/2026 22:58:49</w:t>
             </w:r>
           </w:p>
         </w:tc>
@@ -3324,7 +3324,7 @@
           </w:tcPr>
           <w:p>
             <w:r>
-              <w:t>30/08/2026 22:06:15</w:t>
+              <w:t>30/08/2026 22:58:54</w:t>
             </w:r>
           </w:p>
         </w:tc>
@@ -3384,7 +3384,7 @@
           </w:tcPr>
           <w:p>
             <w:r>
-              <w:t>30/08/2026 22:06:18</w:t>
+              <w:t>30/08/2026 22:58:57</w:t>
             </w:r>
           </w:p>
         </w:tc>
@@ -3444,7 +3444,7 @@
           </w:tcPr>
           <w:p>
             <w:r>
-              <w:t>30/08/2026 22:06:21</w:t>
+              <w:t>30/08/2026 22:59:00</w:t>
             </w:r>
           </w:p>
         </w:tc>
@@ -3504,7 +3504,7 @@
           </w:tcPr>
           <w:p>
             <w:r>
-              <w:t>30/08/2026 22:06:21</w:t>
+              <w:t>30/08/2026 22:59:00</w:t>
             </w:r>
           </w:p>
         </w:tc>
@@ -3564,7 +3564,7 @@
           </w:tcPr>
           <w:p>
             <w:r>
-              <w:t>30/08/2026 22:06:25</w:t>
+              <w:t>30/08/2026 22:59:04</w:t>
             </w:r>
           </w:p>
         </w:tc>
@@ -3624,7 +3624,7 @@
           </w:tcPr>
           <w:p>
             <w:r>
-              <w:t>30/08/2026 22:06:25</w:t>
+              <w:t>30/08/2026 22:59:04</w:t>
             </w:r>
           </w:p>
         </w:tc>
@@ -3686,7 +3686,7 @@
           </w:tcPr>
           <w:p>
             <w:r>
-              <w:t>30/08/2026 22:06:25</w:t>
+              <w:t>30/08/2026 22:59:04</w:t>
             </w:r>
           </w:p>
         </w:tc>
@@ -3746,7 +3746,7 @@
           </w:tcPr>
           <w:p>
             <w:r>
-              <w:t>30/08/2026 22:06:25</w:t>
+              <w:t>30/08/2026 22:59:04</w:t>
             </w:r>
           </w:p>
         </w:tc>
@@ -3806,7 +3806,7 @@
           </w:tcPr>
           <w:p>
             <w:r>
-              <w:t>30/08/2026 22:06:30</w:t>
+              <w:t>30/08/2026 22:59:09</w:t>
             </w:r>
           </w:p>
         </w:tc>
@@ -3866,7 +3866,7 @@
           </w:tcPr>
           <w:p>
             <w:r>
-              <w:t>30/08/2026 22:06:30</w:t>
+              <w:t>30/08/2026 22:59:09</w:t>
             </w:r>
           </w:p>
         </w:tc>
@@ -3926,7 +3926,7 @@
           </w:tcPr>
           <w:p>
             <w:r>
-              <w:t>30/08/2026 22:06:33</w:t>
+              <w:t>30/08/2026 22:59:12</w:t>
             </w:r>
           </w:p>
         </w:tc>
@@ -3986,7 +3986,7 @@
           </w:tcPr>
           <w:p>
             <w:r>
-              <w:t>30/08/2026 22:06:34</w:t>
+              <w:t>30/08/2026 22:59:13</w:t>
             </w:r>
           </w:p>
         </w:tc>
@@ -4046,7 +4046,7 @@
           </w:tcPr>
           <w:p>
             <w:r>
-              <w:t>30/08/2026 22:06:35</w:t>
+              <w:t>30/08/2026 22:59:14</w:t>
             </w:r>
           </w:p>
         </w:tc>
@@ -4066,7 +4066,7 @@
           </w:tcPr>
           <w:p>
             <w:r>
-              <w:t>Drug name: Selenium Drug Valid 1788102388</w:t>
+              <w:t>Drug name: Selenium Drug Valid 1788105547</w:t>
             </w:r>
           </w:p>
         </w:tc>
@@ -4108,7 +4108,7 @@
           </w:tcPr>
           <w:p>
             <w:r>
-              <w:t>30/08/2026 22:06:35</w:t>
+              <w:t>30/08/2026 22:59:14</w:t>
             </w:r>
           </w:p>
         </w:tc>
@@ -4168,7 +4168,7 @@
           </w:tcPr>
           <w:p>
             <w:r>
-              <w:t>30/08/2026 22:06:36</w:t>
+              <w:t>30/08/2026 22:59:15</w:t>
             </w:r>
           </w:p>
         </w:tc>
@@ -4228,7 +4228,7 @@
           </w:tcPr>
           <w:p>
             <w:r>
-              <w:t>30/08/2026 22:06:39</w:t>
+              <w:t>30/08/2026 22:59:18</w:t>
             </w:r>
           </w:p>
         </w:tc>
@@ -4288,17 +4288,17 @@
           </w:tcPr>
           <w:p>
             <w:r>
-              <w:t>30/08/2026 22:06:43</w:t>
-            </w:r>
-          </w:p>
-        </w:tc>
-        <w:tc>
-          <w:tcPr>
-            <w:tcW w:type="dxa" w:w="1440"/>
-          </w:tcPr>
-          <w:p>
-            <w:r>
-              <w:t>Tìm kiếm thuốc vừa thêm: Selenium Drug Valid 1788102388</w:t>
+              <w:t>30/08/2026 22:59:22</w:t>
+            </w:r>
+          </w:p>
+        </w:tc>
+        <w:tc>
+          <w:tcPr>
+            <w:tcW w:type="dxa" w:w="1440"/>
+          </w:tcPr>
+          <w:p>
+            <w:r>
+              <w:t>Tìm kiếm thuốc vừa thêm: Selenium Drug Valid 1788105547</w:t>
             </w:r>
           </w:p>
         </w:tc>
@@ -4348,7 +4348,7 @@
           </w:tcPr>
           <w:p>
             <w:r>
-              <w:t>30/08/2026 22:06:43</w:t>
+              <w:t>30/08/2026 22:59:22</w:t>
             </w:r>
           </w:p>
         </w:tc>
@@ -4368,7 +4368,7 @@
           </w:tcPr>
           <w:p>
             <w:r>
-              <w:t>{'name': 'Selenium Drug Valid 1788102388\nViên nén', 'category': 'Vitamin và khoáng chất', 'price': '12.000đ', 'stock': '107', 'production_date': '20/8/2026', 'expiry_date': '20/8/2027', 'status': 'Còn hạn'}</w:t>
+              <w:t>{'name': 'Selenium Drug Valid 1788105547\nViên nén', 'category': 'Vitamin và khoáng chất', 'price': '12.000đ', 'stock': '107', 'production_date': '20/8/2026', 'expiry_date': '20/8/2027', 'status': 'Còn hạn'}</w:t>
             </w:r>
           </w:p>
         </w:tc>
@@ -4410,7 +4410,7 @@
           </w:tcPr>
           <w:p>
             <w:r>
-              <w:t>30/08/2026 22:06:48</w:t>
+              <w:t>30/08/2026 22:59:27</w:t>
             </w:r>
           </w:p>
         </w:tc>
@@ -4470,7 +4470,7 @@
           </w:tcPr>
           <w:p>
             <w:r>
-              <w:t>30/08/2026 22:06:48</w:t>
+              <w:t>30/08/2026 22:59:27</w:t>
             </w:r>
           </w:p>
         </w:tc>
@@ -4530,7 +4530,7 @@
           </w:tcPr>
           <w:p>
             <w:r>
-              <w:t>30/08/2026 22:06:51</w:t>
+              <w:t>30/08/2026 22:59:30</w:t>
             </w:r>
           </w:p>
         </w:tc>
@@ -4590,7 +4590,7 @@
           </w:tcPr>
           <w:p>
             <w:r>
-              <w:t>30/08/2026 22:06:52</w:t>
+              <w:t>30/08/2026 22:59:31</w:t>
             </w:r>
           </w:p>
         </w:tc>
@@ -4650,7 +4650,7 @@
           </w:tcPr>
           <w:p>
             <w:r>
-              <w:t>30/08/2026 22:06:52</w:t>
+              <w:t>30/08/2026 22:59:31</w:t>
             </w:r>
           </w:p>
         </w:tc>
@@ -4710,7 +4710,7 @@
           </w:tcPr>
           <w:p>
             <w:r>
-              <w:t>30/08/2026 22:06:53</w:t>
+              <w:t>30/08/2026 22:59:32</w:t>
             </w:r>
           </w:p>
         </w:tc>
@@ -4770,7 +4770,7 @@
           </w:tcPr>
           <w:p>
             <w:r>
-              <w:t>30/08/2026 22:06:53</w:t>
+              <w:t>30/08/2026 22:59:32</w:t>
             </w:r>
           </w:p>
         </w:tc>
@@ -4830,7 +4830,7 @@
           </w:tcPr>
           <w:p>
             <w:r>
-              <w:t>30/08/2026 22:06:53</w:t>
+              <w:t>30/08/2026 22:59:32</w:t>
             </w:r>
           </w:p>
         </w:tc>
@@ -4892,7 +4892,7 @@
           </w:tcPr>
           <w:p>
             <w:r>
-              <w:t>30/08/2026 22:06:53</w:t>
+              <w:t>30/08/2026 22:59:32</w:t>
             </w:r>
           </w:p>
         </w:tc>
@@ -4952,7 +4952,7 @@
           </w:tcPr>
           <w:p>
             <w:r>
-              <w:t>30/08/2026 22:06:58</w:t>
+              <w:t>30/08/2026 22:59:37</w:t>
             </w:r>
           </w:p>
         </w:tc>
@@ -5012,7 +5012,7 @@
           </w:tcPr>
           <w:p>
             <w:r>
-              <w:t>30/08/2026 22:06:58</w:t>
+              <w:t>30/08/2026 22:59:37</w:t>
             </w:r>
           </w:p>
         </w:tc>
@@ -5072,7 +5072,7 @@
           </w:tcPr>
           <w:p>
             <w:r>
-              <w:t>30/08/2026 22:07:01</w:t>
+              <w:t>30/08/2026 22:59:40</w:t>
             </w:r>
           </w:p>
         </w:tc>
@@ -5132,7 +5132,7 @@
           </w:tcPr>
           <w:p>
             <w:r>
-              <w:t>30/08/2026 22:07:02</w:t>
+              <w:t>30/08/2026 22:59:41</w:t>
             </w:r>
           </w:p>
         </w:tc>
@@ -5192,7 +5192,7 @@
           </w:tcPr>
           <w:p>
             <w:r>
-              <w:t>30/08/2026 22:07:03</w:t>
+              <w:t>30/08/2026 22:59:42</w:t>
             </w:r>
           </w:p>
         </w:tc>
@@ -5212,7 +5212,7 @@
           </w:tcPr>
           <w:p>
             <w:r>
-              <w:t>Drug name: Selenium Drug Negative 1788102416</w:t>
+              <w:t>Drug name: Selenium Drug Negative 1788105575</w:t>
             </w:r>
           </w:p>
         </w:tc>
@@ -5254,7 +5254,7 @@
           </w:tcPr>
           <w:p>
             <w:r>
-              <w:t>30/08/2026 22:07:03</w:t>
+              <w:t>30/08/2026 22:59:42</w:t>
             </w:r>
           </w:p>
         </w:tc>
@@ -5314,7 +5314,7 @@
           </w:tcPr>
           <w:p>
             <w:r>
-              <w:t>30/08/2026 22:07:03</w:t>
+              <w:t>30/08/2026 22:59:42</w:t>
             </w:r>
           </w:p>
         </w:tc>
@@ -5374,7 +5374,7 @@
           </w:tcPr>
           <w:p>
             <w:r>
-              <w:t>30/08/2026 22:07:03</w:t>
+              <w:t>30/08/2026 22:59:42</w:t>
             </w:r>
           </w:p>
         </w:tc>
@@ -5434,7 +5434,7 @@
           </w:tcPr>
           <w:p>
             <w:r>
-              <w:t>30/08/2026 22:07:03</w:t>
+              <w:t>30/08/2026 22:59:42</w:t>
             </w:r>
           </w:p>
         </w:tc>
@@ -5494,7 +5494,7 @@
           </w:tcPr>
           <w:p>
             <w:r>
-              <w:t>30/08/2026 22:07:03</w:t>
+              <w:t>30/08/2026 22:59:42</w:t>
             </w:r>
           </w:p>
         </w:tc>
@@ -5556,7 +5556,7 @@
           </w:tcPr>
           <w:p>
             <w:r>
-              <w:t>30/08/2026 22:07:03</w:t>
+              <w:t>30/08/2026 22:59:42</w:t>
             </w:r>
           </w:p>
         </w:tc>
@@ -5616,7 +5616,7 @@
           </w:tcPr>
           <w:p>
             <w:r>
-              <w:t>30/08/2026 22:07:08</w:t>
+              <w:t>30/08/2026 22:59:47</w:t>
             </w:r>
           </w:p>
         </w:tc>
@@ -5676,7 +5676,7 @@
           </w:tcPr>
           <w:p>
             <w:r>
-              <w:t>30/08/2026 22:07:09</w:t>
+              <w:t>30/08/2026 22:59:48</w:t>
             </w:r>
           </w:p>
         </w:tc>
@@ -5736,7 +5736,7 @@
           </w:tcPr>
           <w:p>
             <w:r>
-              <w:t>30/08/2026 22:07:12</w:t>
+              <w:t>30/08/2026 22:59:51</w:t>
             </w:r>
           </w:p>
         </w:tc>
@@ -5796,7 +5796,7 @@
           </w:tcPr>
           <w:p>
             <w:r>
-              <w:t>30/08/2026 22:07:12</w:t>
+              <w:t>30/08/2026 22:59:51</w:t>
             </w:r>
           </w:p>
         </w:tc>
@@ -5856,7 +5856,7 @@
           </w:tcPr>
           <w:p>
             <w:r>
-              <w:t>30/08/2026 22:07:13</w:t>
+              <w:t>30/08/2026 22:59:52</w:t>
             </w:r>
           </w:p>
         </w:tc>
@@ -5876,7 +5876,7 @@
           </w:tcPr>
           <w:p>
             <w:r>
-              <w:t>Drug name: Selenium Drug Invalid Date 1788102427</w:t>
+              <w:t>Drug name: Selenium Drug Invalid Date 1788105586</w:t>
             </w:r>
           </w:p>
         </w:tc>
@@ -5918,7 +5918,7 @@
           </w:tcPr>
           <w:p>
             <w:r>
-              <w:t>30/08/2026 22:07:13</w:t>
+              <w:t>30/08/2026 22:59:52</w:t>
             </w:r>
           </w:p>
         </w:tc>
@@ -5978,7 +5978,7 @@
           </w:tcPr>
           <w:p>
             <w:r>
-              <w:t>30/08/2026 22:07:13</w:t>
+              <w:t>30/08/2026 22:59:52</w:t>
             </w:r>
           </w:p>
         </w:tc>
@@ -6038,7 +6038,7 @@
           </w:tcPr>
           <w:p>
             <w:r>
-              <w:t>30/08/2026 22:07:14</w:t>
+              <w:t>30/08/2026 22:59:53</w:t>
             </w:r>
           </w:p>
         </w:tc>
@@ -6098,7 +6098,7 @@
           </w:tcPr>
           <w:p>
             <w:r>
-              <w:t>30/08/2026 22:07:14</w:t>
+              <w:t>30/08/2026 22:59:53</w:t>
             </w:r>
           </w:p>
         </w:tc>
@@ -6160,7 +6160,7 @@
           </w:tcPr>
           <w:p>
             <w:r>
-              <w:t>30/08/2026 22:07:14</w:t>
+              <w:t>30/08/2026 22:59:53</w:t>
             </w:r>
           </w:p>
         </w:tc>
@@ -6222,7 +6222,7 @@
           </w:tcPr>
           <w:p>
             <w:r>
-              <w:t>30/08/2026 22:07:34</w:t>
+              <w:t>30/08/2026 23:00:13</w:t>
             </w:r>
           </w:p>
         </w:tc>
@@ -6282,7 +6282,7 @@
           </w:tcPr>
           <w:p>
             <w:r>
-              <w:t>30/08/2026 22:07:34</w:t>
+              <w:t>30/08/2026 23:00:13</w:t>
             </w:r>
           </w:p>
         </w:tc>
@@ -6342,7 +6342,7 @@
           </w:tcPr>
           <w:p>
             <w:r>
-              <w:t>30/08/2026 22:07:38</w:t>
+              <w:t>30/08/2026 23:00:17</w:t>
             </w:r>
           </w:p>
         </w:tc>
@@ -6402,7 +6402,7 @@
           </w:tcPr>
           <w:p>
             <w:r>
-              <w:t>30/08/2026 22:07:42</w:t>
+              <w:t>30/08/2026 23:00:21</w:t>
             </w:r>
           </w:p>
         </w:tc>
@@ -6422,7 +6422,7 @@
           </w:tcPr>
           <w:p>
             <w:r>
-              <w:t>Drug: Selenium Drug Delete 1788102448</w:t>
+              <w:t>Drug: Selenium Drug Delete 1788105607</w:t>
             </w:r>
           </w:p>
         </w:tc>
@@ -6464,7 +6464,7 @@
           </w:tcPr>
           <w:p>
             <w:r>
-              <w:t>30/08/2026 22:07:42</w:t>
+              <w:t>30/08/2026 23:00:21</w:t>
             </w:r>
           </w:p>
         </w:tc>
@@ -6524,7 +6524,7 @@
           </w:tcPr>
           <w:p>
             <w:r>
-              <w:t>30/08/2026 22:07:45</w:t>
+              <w:t>30/08/2026 23:00:24</w:t>
             </w:r>
           </w:p>
         </w:tc>
@@ -6584,7 +6584,7 @@
           </w:tcPr>
           <w:p>
             <w:r>
-              <w:t>30/08/2026 22:07:48</w:t>
+              <w:t>30/08/2026 23:00:27</w:t>
             </w:r>
           </w:p>
         </w:tc>
@@ -6644,7 +6644,7 @@
           </w:tcPr>
           <w:p>
             <w:r>
-              <w:t>30/08/2026 22:07:51</w:t>
+              <w:t>30/08/2026 23:00:30</w:t>
             </w:r>
           </w:p>
         </w:tc>
@@ -6704,7 +6704,7 @@
           </w:tcPr>
           <w:p>
             <w:r>
-              <w:t>30/08/2026 22:07:54</w:t>
+              <w:t>30/08/2026 23:00:33</w:t>
             </w:r>
           </w:p>
         </w:tc>

</xml_diff>